<commit_message>
rename entry to index.html
</commit_message>
<xml_diff>
--- a/KP_hookahmarket_3etapa.docx
+++ b/KP_hookahmarket_3etapa.docx
@@ -69,7 +69,7 @@
                 <w:sz w:val="20"/>
                 <w:szCs w:val="20"/>
               </w:rPr>
-              <w:t xml:space="preserve">Дата: 12.08.2026</w:t>
+              <w:t xml:space="preserve">Дата: 24.08.2026 (обновлено по итогам аудита CRM)</w:t>
             </w:r>
           </w:p>
         </w:tc>
@@ -567,7 +567,7 @@
           <w:sz w:val="19"/>
           <w:szCs w:val="19"/>
         </w:rPr>
-        <w:t xml:space="preserve">Точная стоимость интеграции остатков подтверждается после аудита CRM в начале этапа. Способ приёма заказов — WhatsApp или напрямую в CRM — также фиксируем по итогам аудита и предложим рекомендацию.</w:t>
+        <w:t xml:space="preserve">По итогам аудита CRM: заказ с сайта создаётся напрямую в кассе нужного филиала через API, без ручной пересылки — стоимость этапа не меняется.</w:t>
       </w:r>
     </w:p>
     <w:p>
@@ -746,7 +746,7 @@
                 <w:sz w:val="20"/>
                 <w:szCs w:val="20"/>
               </w:rPr>
-              <w:t xml:space="preserve">от 150 000 ₸ *</w:t>
+              <w:t xml:space="preserve">280 000 ₸</w:t>
             </w:r>
           </w:p>
         </w:tc>
@@ -820,7 +820,72 @@
                 <w:sz w:val="20"/>
                 <w:szCs w:val="20"/>
               </w:rPr>
-              <w:t xml:space="preserve">по итогам аудита CRM</w:t>
+              <w:t xml:space="preserve">320 000 ₸</w:t>
+            </w:r>
+          </w:p>
+        </w:tc>
+      </w:tr>
+    </w:tbl>
+    <w:tbl>
+      <w:tblPr>
+        <w:tblW w:type="dxa" w:w="9674"/>
+        <w:tblBorders>
+          <w:top w:val="single" w:color="auto" w:sz="4"/>
+          <w:left w:val="single" w:color="auto" w:sz="4"/>
+          <w:bottom w:val="single" w:color="auto" w:sz="4"/>
+          <w:right w:val="single" w:color="auto" w:sz="4"/>
+          <w:insideH w:val="single" w:color="auto" w:sz="4"/>
+          <w:insideV w:val="single" w:color="auto" w:sz="4"/>
+        </w:tblBorders>
+      </w:tblPr>
+      <w:tblGrid>
+        <w:gridCol w:w="7800"/>
+        <w:gridCol w:w="1874"/>
+      </w:tblGrid>
+      <w:tr>
+        <w:tc>
+          <w:tcPr>
+            <w:tcW w:type="dxa" w:w="7800"/>
+            <w:tcMar>
+              <w:top w:type="dxa" w:w="100"/>
+              <w:left w:type="dxa" w:w="120"/>
+              <w:bottom w:type="dxa" w:w="100"/>
+              <w:right w:type="dxa" w:w="120"/>
+            </w:tcMar>
+            <w:vAlign w:val="center"/>
+          </w:tcPr>
+          <w:p>
+            <w:r>
+              <w:rPr>
+                <w:b/>
+                <w:bCs/>
+                <w:sz w:val="20"/>
+                <w:szCs w:val="20"/>
+              </w:rPr>
+              <w:t xml:space="preserve">Стоимость Этапа 2</w:t>
+            </w:r>
+          </w:p>
+        </w:tc>
+        <w:tc>
+          <w:tcPr>
+            <w:tcW w:type="dxa" w:w="1874"/>
+            <w:tcMar>
+              <w:top w:type="dxa" w:w="100"/>
+              <w:left w:type="dxa" w:w="120"/>
+              <w:bottom w:type="dxa" w:w="100"/>
+              <w:right w:type="dxa" w:w="120"/>
+            </w:tcMar>
+            <w:vAlign w:val="center"/>
+          </w:tcPr>
+          <w:p>
+            <w:r>
+              <w:rPr>
+                <w:b/>
+                <w:bCs/>
+                <w:sz w:val="20"/>
+                <w:szCs w:val="20"/>
+              </w:rPr>
+              <w:t xml:space="preserve">600 000 ₸</w:t>
             </w:r>
           </w:p>
         </w:tc>
@@ -838,7 +903,7 @@
           <w:sz w:val="19"/>
           <w:szCs w:val="19"/>
         </w:rPr>
-        <w:t xml:space="preserve">* Точная стоимость фильтров — после проверки, структурированы ли атрибуты товаров в CRM отдельными полями.</w:t>
+        <w:t xml:space="preserve">Стоимость фильтров учитывает разработку парсера характеристик (бренд, крепость, вкус, фасовка распознаются из названия товара, т.к. в CRM это не отдельные поля) и панель для ручной доразметки того, что парсер не распознает с первого раза.</w:t>
       </w:r>
     </w:p>
     <w:p>

</xml_diff>